<commit_message>
Aula 12: atualiza apostila e slides
</commit_message>
<xml_diff>
--- a/Aula 12 - 23-10-2026/Aula 12 - Apostila do Aluno.docx
+++ b/Aula 12 - 23-10-2026/Aula 12 - Apostila do Aluno.docx
@@ -114,7 +114,7 @@
         <w:rPr>
           <w:i w:val="0"/>
         </w:rPr>
-        <w:t>Até aqui modelamos o TechBurger por dentro (regras, requisitos e UML), pensamos em quem usa (UX) e em com quem ele conversa (integrações). Todo esse sistema gera DADOS: pedidos, pagamentos, notas. Hoje aprendemos a organizá-los — o primeiro passo para que a gerente Fernanda tome decisões com base em números confiáveis. Na próxima aula, vamos analisá-los.</w:t>
+        <w:t>Até aqui modelamos o TechBurger por dentro (regras, requisitos e UML), pensamos em quem usa (UX) e em com quem ele conversa (integrações). Todo esse sistema gera DADOS: pedidos, pagamentos, notas. Hoje aprendemos a organizá-los — o primeiro passo para que a gerente Fernanda tome decisões com base em números confiáveis. Na próxima aula, fazemos uma revisão geral de tudo o que vimos.</w:t>
       </w:r>
     </w:p>
     <w:tbl>
@@ -3474,7 +3474,7 @@
         <w:rPr>
           <w:i w:val="0"/>
         </w:rPr>
-        <w:t>os atributos da classe (Aula 5) viram colunas; as regras de negócio (Aula 1) definem os valores permitidos; a lista fechada na tela (Aula 10) e o contrato da API (Aula 11) impedem o erro de nascer; e os dados organizados seguem para a análise e o Ciclo PDCA (Aula 13).</w:t>
+        <w:t>os atributos da classe (Aula 5) viram colunas; as regras de negócio (Aula 1) definem os valores permitidos; a lista fechada na tela (Aula 10) e o contrato da API (Aula 11) impedem o erro de nascer; e os dados organizados ficam prontos para a análise e as decisões da gerente.</w:t>
       </w:r>
     </w:p>
     <w:p>

</xml_diff>